<commit_message>
Rename entity to PA Registered Office Services, LLC
Updated across all files:
- CROP registration documents (cover letter, statement of address, filing guide)
- Service agreement template
- SuiteDash niche config + .env.example
- Marketing website
- Operations bible
- README
- All generator scripts

Entity name: PA Registered Office Services, LLC
DBA: PA CROP Services
Domain: pacropservices.com
</commit_message>
<xml_diff>
--- a/legal/PA-CROP-Service-Agreement.docx
+++ b/legal/PA-CROP-Service-Agreement.docx
@@ -100,7 +100,7 @@
           <w:sz w:val="22"/>
           <w:szCs w:val="22"/>
         </w:rPr>
-        <w:t xml:space="preserve">Dynasty Compliance Services, LLC, a Pennsylvania limited liability company, with its principal office located at [ADDRESS], Erie, Pennsylvania 16501 (“Provider” or “CROP”)</w:t>
+        <w:t xml:space="preserve">PA Registered Office Services, LLC, a Pennsylvania limited liability company, with its principal office located at [ADDRESS], Erie, Pennsylvania 16501 (“Provider” or “CROP”)</w:t>
       </w:r>
     </w:p>
     <w:p>
@@ -1508,7 +1508,7 @@
           <w:sz w:val="22"/>
           <w:szCs w:val="22"/>
         </w:rPr>
-        <w:t xml:space="preserve"> Dynasty Compliance Services, LLC</w:t>
+        <w:t xml:space="preserve"> PA Registered Office Services, LLC</w:t>
       </w:r>
     </w:p>
     <w:p>

</xml_diff>